<commit_message>
Address review: reproducible k-selection, masking, tests, lockfile, config, docx fixes
</commit_message>
<xml_diff>
--- a/report/report.docx
+++ b/report/report.docx
@@ -669,9 +669,9 @@
       </w:r>
     </w:p>
     <w:p>
-      <w:r>
-        <w:t xml:space="preserve">1. </w:t>
-      </w:r>
+      <w:pPr>
+        <w:pStyle w:val="ListNumber"/>
+      </w:pPr>
       <w:r>
         <w:rPr>
           <w:b/>
@@ -701,9 +701,9 @@
       </w:r>
     </w:p>
     <w:p>
-      <w:r>
-        <w:t xml:space="preserve">2. </w:t>
-      </w:r>
+      <w:pPr>
+        <w:pStyle w:val="ListNumber"/>
+      </w:pPr>
       <w:r>
         <w:rPr>
           <w:b/>
@@ -715,9 +715,9 @@
       </w:r>
     </w:p>
     <w:p>
-      <w:r>
-        <w:t xml:space="preserve">3. </w:t>
-      </w:r>
+      <w:pPr>
+        <w:pStyle w:val="ListNumber"/>
+      </w:pPr>
       <w:r>
         <w:rPr>
           <w:b/>
@@ -738,9 +738,9 @@
       </w:r>
     </w:p>
     <w:p>
-      <w:r>
-        <w:t xml:space="preserve">4. </w:t>
-      </w:r>
+      <w:pPr>
+        <w:pStyle w:val="ListNumber"/>
+      </w:pPr>
       <w:r>
         <w:rPr>
           <w:b/>
@@ -855,9 +855,9 @@
       </w:r>
     </w:p>
     <w:p>
-      <w:r>
-        <w:t xml:space="preserve">1. </w:t>
-      </w:r>
+      <w:pPr>
+        <w:pStyle w:val="ListNumber"/>
+      </w:pPr>
       <w:r>
         <w:rPr>
           <w:b/>
@@ -869,9 +869,9 @@
       </w:r>
     </w:p>
     <w:p>
-      <w:r>
-        <w:t xml:space="preserve">2. </w:t>
-      </w:r>
+      <w:pPr>
+        <w:pStyle w:val="ListNumber"/>
+      </w:pPr>
       <w:r>
         <w:rPr>
           <w:b/>
@@ -910,9 +910,9 @@
       </w:r>
     </w:p>
     <w:p>
-      <w:r>
-        <w:t xml:space="preserve">3. </w:t>
-      </w:r>
+      <w:pPr>
+        <w:pStyle w:val="ListNumber"/>
+      </w:pPr>
       <w:r>
         <w:rPr>
           <w:b/>
@@ -969,9 +969,9 @@
       </w:r>
     </w:p>
     <w:p>
-      <w:r>
-        <w:t xml:space="preserve">4. </w:t>
-      </w:r>
+      <w:pPr>
+        <w:pStyle w:val="ListNumber"/>
+      </w:pPr>
       <w:r>
         <w:rPr>
           <w:b/>
@@ -981,7 +981,7 @@
     </w:p>
     <w:p>
       <w:r>
-        <w:t xml:space="preserve">   - </w:t>
+        <w:t xml:space="preserve">- </w:t>
       </w:r>
       <w:r>
         <w:rPr>
@@ -1035,12 +1035,7 @@
         <w:t>cpi1k</w:t>
       </w:r>
       <w:r>
-        <w:t>) for readability. Medians are used throughout because both inputs are heavily right-skewed.</w:t>
-      </w:r>
-    </w:p>
-    <w:p>
-      <w:r>
-        <w:t xml:space="preserve">   - </w:t>
+        <w:t xml:space="preserve">) for readability. Medians are used throughout because both inputs are heavily right-skewed. - </w:t>
       </w:r>
       <w:r>
         <w:rPr>
@@ -1049,12 +1044,7 @@
         <w:t>era</w:t>
       </w:r>
       <w:r>
-        <w:t xml:space="preserve"> — five creation-year bins (≤2015, 2016–17, 2018–19, 2020–21, 2022–24) chosen to balance sample sizes given the coverage skew (778 / 8,013 / 16,561 / 17,772 / 6,142 posts).</w:t>
-      </w:r>
-    </w:p>
-    <w:p>
-      <w:r>
-        <w:t xml:space="preserve">   - </w:t>
+        <w:t xml:space="preserve"> — five creation-year bins (≤2015, 2016–17, 2018–19, 2020–21, 2022–24) chosen to balance sample sizes given the coverage skew (778 / 8,013 / 16,561 / 17,772 / 6,142 posts). - </w:t>
       </w:r>
       <w:r>
         <w:rPr>
@@ -1072,12 +1062,7 @@
         <w:t>self post, reddit-native (i.redd.it / v.redd.it), imgur, youtube, other video hosts, other external, no link</w:t>
       </w:r>
       <w:r>
-        <w:t>.</w:t>
-      </w:r>
-    </w:p>
-    <w:p>
-      <w:r>
-        <w:t xml:space="preserve">   - </w:t>
+        <w:t xml:space="preserve">. - </w:t>
       </w:r>
       <w:r>
         <w:rPr>
@@ -1126,9 +1111,9 @@
       </w:r>
     </w:p>
     <w:p>
-      <w:r>
-        <w:t xml:space="preserve">5. </w:t>
-      </w:r>
+      <w:pPr>
+        <w:pStyle w:val="ListNumber"/>
+      </w:pPr>
       <w:r>
         <w:rPr>
           <w:b/>
@@ -1149,9 +1134,9 @@
       </w:r>
     </w:p>
     <w:p>
-      <w:r>
-        <w:t xml:space="preserve">6. </w:t>
-      </w:r>
+      <w:pPr>
+        <w:pStyle w:val="ListNumber"/>
+      </w:pPr>
       <w:r>
         <w:rPr>
           <w:b/>
@@ -1181,9 +1166,9 @@
       </w:r>
     </w:p>
     <w:p>
-      <w:r>
-        <w:t xml:space="preserve">7. </w:t>
-      </w:r>
+      <w:pPr>
+        <w:pStyle w:val="ListNumber"/>
+      </w:pPr>
       <w:r>
         <w:rPr>
           <w:b/>
@@ -2252,7 +2237,7 @@
       <w:r>
         <w:drawing>
           <wp:inline xmlns:a="http://schemas.openxmlformats.org/drawingml/2006/main" xmlns:pic="http://schemas.openxmlformats.org/drawingml/2006/picture">
-            <wp:extent cx="5943600" cy="8047721"/>
+            <wp:extent cx="5943600" cy="8136810"/>
             <wp:docPr id="8" name="Picture 8"/>
             <wp:cNvGraphicFramePr>
               <a:graphicFrameLocks noChangeAspect="1"/>
@@ -2273,7 +2258,7 @@
                   <pic:spPr>
                     <a:xfrm>
                       <a:off x="0" y="0"/>
-                      <a:ext cx="5943600" cy="8047721"/>
+                      <a:ext cx="5943600" cy="8136810"/>
                     </a:xfrm>
                     <a:prstGeom prst="rect"/>
                   </pic:spPr>
@@ -2793,7 +2778,7 @@
           <w:i/>
           <w:sz w:val="19"/>
         </w:rPr>
-        <w:t xml:space="preserve"> The profile map: each dot is one subreddit, positioned by discussion intensity (x) and image share (y); colours show five engagement profiles summarised by k-means (k = 5; selection rationale and stability in Appendix C).</w:t>
+        <w:t xml:space="preserve"> The profile map: each dot is one subreddit, positioned by discussion intensity (x) and image share (y); colours show five engagement profiles summarised by k-means (k = 5; selection rule, table and stability in Appendix C).</w:t>
       </w:r>
     </w:p>
     <w:p>
@@ -2804,7 +2789,7 @@
         <w:t>What it shows.</w:t>
       </w:r>
       <w:r>
-        <w:t xml:space="preserve"> Read the geometry first: even without the colouring, the 50 communities separate into visible bands along the two axes — image-heavy feeds along the top, text communities along the bottom, and AskReddit isolated at the far right. Colouring each dot by a k-means grouping (k = 5, chosen where the silhouette curve stops improving without fragmenting into singleton clusters — Appendix C) labels five interpretable profiles: </w:t>
+        <w:t xml:space="preserve"> Read the geometry first: even without the colouring, the 50 communities separate into visible bands along the two axes — image-heavy feeds along the top, text communities along the bottom, and AskReddit isolated at the far right. Colouring each dot by a k-means grouping (k = 5 — the highest-silhouette partition in which all but at most one profile contains at least six of the 50 communities; full table in Appendix C) labels five interpretable profiles: </w:t>
       </w:r>
       <w:r>
         <w:rPr>
@@ -3023,8 +3008,9 @@
         </w:rPr>
         <w:t>F1 — Engagement style spans a 40× spectrum and is stable over time.</w:t>
       </w:r>
-    </w:p>
-    <w:p>
+      <w:r>
+        <w:t xml:space="preserve"> </w:t>
+      </w:r>
       <w:r>
         <w:rPr>
           <w:i/>
@@ -3032,10 +3018,8 @@
         <w:t>Observation:</w:t>
       </w:r>
       <w:r>
-        <w:t xml:space="preserve"> median comments per 1,000 upvotes ranges from 5.7 (wholesomememes) to 230 (AskReddit); era-by-era style rankings correlate +0.85 to +0.92 with the overall ranking (Figs. 4, 8).</w:t>
-      </w:r>
-    </w:p>
-    <w:p>
+        <w:t xml:space="preserve"> median comments per 1,000 upvotes ranges from 5.7 (wholesomememes) to 230 (AskReddit); era-by-era style rankings correlate +0.85 to +0.92 with the overall ranking (Figs. 4, 8). </w:t>
+      </w:r>
       <w:r>
         <w:rPr>
           <w:i/>
@@ -3062,8 +3046,9 @@
         </w:rPr>
         <w:t>F2 — Success has (at least) two decoupled currencies: approval and participation.</w:t>
       </w:r>
-    </w:p>
-    <w:p>
+      <w:r>
+        <w:t xml:space="preserve"> </w:t>
+      </w:r>
       <w:r>
         <w:rPr>
           <w:i/>
@@ -3071,10 +3056,8 @@
         <w:t>Observation:</w:t>
       </w:r>
       <w:r>
-        <w:t xml:space="preserve"> score and comments correlate only moderately (ρ = 0.56); at matched scores, comment counts span two orders of magnitude; text posts dominate the high-comment region (Fig. 11).</w:t>
-      </w:r>
-    </w:p>
-    <w:p>
+        <w:t xml:space="preserve"> score and comments correlate only moderately (ρ = 0.56); at matched scores, comment counts span two orders of magnitude; text posts dominate the high-comment region (Fig. 11). </w:t>
+      </w:r>
       <w:r>
         <w:rPr>
           <w:i/>
@@ -3098,8 +3081,9 @@
         </w:rPr>
         <w:t>F3 — Contested posts are discussed posts.</w:t>
       </w:r>
-    </w:p>
-    <w:p>
+      <w:r>
+        <w:t xml:space="preserve"> </w:t>
+      </w:r>
       <w:r>
         <w:rPr>
           <w:i/>
@@ -3107,10 +3091,8 @@
         <w:t>Observation:</w:t>
       </w:r>
       <w:r>
-        <w:t xml:space="preserve"> upvote ratio falls as comments rise (ρ = −0.45); the most contested community (IAmA, median ratio 0.83) is a discussion space; the most unanimous (travel, anime, 0.97–0.98) are image feeds (Fig. 12).</w:t>
-      </w:r>
-    </w:p>
-    <w:p>
+        <w:t xml:space="preserve"> upvote ratio falls as comments rise (ρ = −0.45); the most contested community (IAmA, median ratio 0.83) is a discussion space; the most unanimous (travel, anime, 0.97–0.98) are image feeds (Fig. 12). </w:t>
+      </w:r>
       <w:r>
         <w:rPr>
           <w:i/>
@@ -3134,8 +3116,9 @@
         </w:rPr>
         <w:t>F4 — The platform migrated: top-post media moved inside Reddit.</w:t>
       </w:r>
-    </w:p>
-    <w:p>
+      <w:r>
+        <w:t xml:space="preserve"> </w:t>
+      </w:r>
       <w:r>
         <w:rPr>
           <w:i/>
@@ -3143,10 +3126,8 @@
         <w:t>Observation:</w:t>
       </w:r>
       <w:r>
-        <w:t xml:space="preserve"> imgur's share of top posts fell 19.6% → 0.3% (2015 → 2024) while Reddit-native hosting rose 0% → 45.1%; links fell from ~52% to ~35% of top posts while images and video rose (Figs. 9, 10). The inflection matches Reddit's native image hosting launch (mid-2016) and native video launch (Aug 2017) [2][3].</w:t>
-      </w:r>
-    </w:p>
-    <w:p>
+        <w:t xml:space="preserve"> imgur's share of top posts fell 19.6% → 0.3% (2015 → 2024) while Reddit-native hosting rose 0% → 45.1%; links fell from ~52% to ~35% of top posts while images and video rose (Figs. 9, 10). The inflection matches Reddit's native image hosting launch (mid-2016) and native video launch (Aug 2017) [2][3]. </w:t>
+      </w:r>
       <w:r>
         <w:rPr>
           <w:i/>
@@ -3173,8 +3154,9 @@
         </w:rPr>
         <w:t>F5 — The "price of fame" roughly tripled, then the record ends mid-sentence.</w:t>
       </w:r>
-    </w:p>
-    <w:p>
+      <w:r>
+        <w:t xml:space="preserve"> </w:t>
+      </w:r>
       <w:r>
         <w:rPr>
           <w:i/>
@@ -3182,10 +3164,8 @@
         <w:t>Observation:</w:t>
       </w:r>
       <w:r>
-        <w:t xml:space="preserve"> median top-post score rose from ~13k (2014) to ~47k (2020–21), then drops to 17k in 2024 (Fig. 3).</w:t>
-      </w:r>
-    </w:p>
-    <w:p>
+        <w:t xml:space="preserve"> median top-post score rose from ~13k (2014) to ~47k (2020–21), then drops to 17k in 2024 (Fig. 3). </w:t>
+      </w:r>
       <w:r>
         <w:rPr>
           <w:i/>
@@ -3209,8 +3189,9 @@
         </w:rPr>
         <w:t>F6 — Content form is structural and maps onto engagement profiles.</w:t>
       </w:r>
-    </w:p>
-    <w:p>
+      <w:r>
+        <w:t xml:space="preserve"> </w:t>
+      </w:r>
       <w:r>
         <w:rPr>
           <w:i/>
@@ -3218,10 +3199,8 @@
         <w:t>Observation:</w:t>
       </w:r>
       <w:r>
-        <w:t xml:space="preserve"> post-type composition is near-deterministic for many communities (100% text for four; &gt; 90% images for three); on the profile map (Fig. 13) the communities separate into five visually distinct groups along content form × engagement mode, with the k-means colouring (k = 5, stable across seeds, mean ARI 0.88) providing the labels.</w:t>
-      </w:r>
-    </w:p>
-    <w:p>
+        <w:t xml:space="preserve"> post-type composition is near-deterministic for many communities (100% text for four; &gt; 90% images for three); on the profile map (Fig. 13) the communities separate into five visually distinct groups along content form × engagement mode, with the k-means colouring (k = 5, stable across seeds, mean ARI 0.88) providing the labels. </w:t>
+      </w:r>
       <w:r>
         <w:rPr>
           <w:i/>
@@ -3245,8 +3224,9 @@
         </w:rPr>
         <w:t>F7 — Media travels; text stays home.</w:t>
       </w:r>
-    </w:p>
-    <w:p>
+      <w:r>
+        <w:t xml:space="preserve"> </w:t>
+      </w:r>
       <w:r>
         <w:rPr>
           <w:i/>
@@ -3254,10 +3234,8 @@
         <w:t>Observation:</w:t>
       </w:r>
       <w:r>
-        <w:t xml:space="preserve"> video posts have a median of 18 crossposts and images 7, versus 1 for text posts; crossposts correlate with score (ρ = 0.65).</w:t>
-      </w:r>
-    </w:p>
-    <w:p>
+        <w:t xml:space="preserve"> video posts have a median of 18 crossposts and images 7, versus 1 for text posts; crossposts correlate with score (ρ = 0.65). </w:t>
+      </w:r>
       <w:r>
         <w:rPr>
           <w:i/>
@@ -3293,8 +3271,9 @@
         </w:rPr>
         <w:t>F8 — All-time lists age at different speeds.</w:t>
       </w:r>
-    </w:p>
-    <w:p>
+      <w:r>
+        <w:t xml:space="preserve"> </w:t>
+      </w:r>
       <w:r>
         <w:rPr>
           <w:i/>
@@ -3302,10 +3281,8 @@
         <w:t>Observation:</w:t>
       </w:r>
       <w:r>
-        <w:t xml:space="preserve"> 2022–24-era share of top posts ranges from 0.5% (WritingPrompts) to 36.3% (Art) (Fig. 14).</w:t>
-      </w:r>
-    </w:p>
-    <w:p>
+        <w:t xml:space="preserve"> 2022–24-era share of top posts ranges from 0.5% (WritingPrompts) to 36.3% (Art) (Fig. 14). </w:t>
+      </w:r>
       <w:r>
         <w:rPr>
           <w:i/>
@@ -3651,12 +3628,7 @@
     </w:p>
     <w:p>
       <w:r>
-        <w:t>Each team member submits a separate, honestly completed declaration; the</w:t>
-      </w:r>
-    </w:p>
-    <w:p>
-      <w:r>
-        <w:t xml:space="preserve">fillable forms are in </w:t>
+        <w:t xml:space="preserve">Each team member submits a separate, honestly completed declaration; the fillable forms are in </w:t>
       </w:r>
       <w:r>
         <w:rPr>
@@ -3665,37 +3637,7 @@
         <w:t>report/AI_declarations.md</w:t>
       </w:r>
       <w:r>
-        <w:t xml:space="preserve"> (one per member:</w:t>
-      </w:r>
-    </w:p>
-    <w:p>
-      <w:r>
-        <w:t>Sidhanth Prabhu, Shrey Modi, Parthsarathi Samanta). The declarations must</w:t>
-      </w:r>
-    </w:p>
-    <w:p>
-      <w:r>
-        <w:t>reflect each member's actual AI usage. As a team-level statement: AI tools</w:t>
-      </w:r>
-    </w:p>
-    <w:p>
-      <w:r>
-        <w:t>assisted with code scaffolding, figure generation, and drafting; every</w:t>
-      </w:r>
-    </w:p>
-    <w:p>
-      <w:r>
-        <w:t>statistic, figure, and external fact cited in this report was computed or</w:t>
-      </w:r>
-    </w:p>
-    <w:p>
-      <w:r>
-        <w:t>verified by the team against the actual dataset and primary sources, and is</w:t>
-      </w:r>
-    </w:p>
-    <w:p>
-      <w:r>
-        <w:t xml:space="preserve">reproducible via </w:t>
+        <w:t xml:space="preserve"> (one per member: Sidhanth Prabhu, Shrey Modi, Parthsarathi Samanta). The declarations must reflect each member's actual AI usage. As a team-level statement: AI tools assisted with code scaffolding, figure generation, and drafting; every statistic, figure, and external fact cited in this report was computed or verified by the team against the actual dataset and primary sources, and is reproducible via </w:t>
       </w:r>
       <w:r>
         <w:rPr>
@@ -3843,17 +3785,34 @@
     </w:p>
     <w:p>
       <w:r>
-        <w:t>We standardised five community-level features (log discussion intensity, log</w:t>
-      </w:r>
-    </w:p>
-    <w:p>
-      <w:r>
-        <w:t>median score, median upvote ratio, image share, text share) and ran k-means</w:t>
-      </w:r>
-    </w:p>
-    <w:p>
-      <w:r>
-        <w:t>for k = 2…8 (10 restarts each):</w:t>
+        <w:t xml:space="preserve">We standardised five community-level features (log discussion intensity, log median score, median upvote ratio, image share, text share) and ran k-means for k = 2…8 (10 restarts each). This appendix is reproducible: </w:t>
+      </w:r>
+      <w:r>
+        <w:rPr>
+          <w:rFonts w:ascii="Consolas" w:hAnsi="Consolas"/>
+        </w:rPr>
+        <w:t>src/06_k_selection.py</w:t>
+      </w:r>
+      <w:r>
+        <w:t xml:space="preserve"> regenerates the table and the stability statistic below, writing them to </w:t>
+      </w:r>
+      <w:r>
+        <w:rPr>
+          <w:rFonts w:ascii="Consolas" w:hAnsi="Consolas"/>
+        </w:rPr>
+        <w:t>data/processed/k_selection.csv</w:t>
+      </w:r>
+      <w:r>
+        <w:t xml:space="preserve">, and the same selection rule (in </w:t>
+      </w:r>
+      <w:r>
+        <w:rPr>
+          <w:rFonts w:ascii="Consolas" w:hAnsi="Consolas"/>
+        </w:rPr>
+        <w:t>src/vizutils.py</w:t>
+      </w:r>
+      <w:r>
+        <w:t>) is what Figure 13 uses.</w:t>
       </w:r>
     </w:p>
     <w:tbl>
@@ -4181,42 +4140,27 @@
     <w:p/>
     <w:p>
       <w:r>
-        <w:t>k = 5 is the most detailed partition before further gains in silhouette come</w:t>
+        <w:rPr>
+          <w:b/>
+        </w:rPr>
+        <w:t>Selection rule (implemented in `src/vizutils.select_k`).</w:t>
+      </w:r>
+      <w:r>
+        <w:t xml:space="preserve"> Among k = 2…8, we keep the partitions in which all but at most one profile contains at least six of the 50 communities (≥ 12%) — the single allowance covers the structural outlier AskReddit, which is alone at k = 5 already — and take the highest silhouette among those. This selects k = 5: k = 6 scores a higher silhouette (0.389) only by splitting the coherent advice &amp; Q&amp;A profile into fragments of 5 and 6, which the rule disallows; k = 7–8 fragment further into singletons and pairs.</w:t>
       </w:r>
     </w:p>
     <w:p>
       <w:r>
-        <w:t>only from isolating additional outliers as singleton or near-singleton</w:t>
-      </w:r>
-    </w:p>
-    <w:p>
-      <w:r>
-        <w:t>clusters (k = 6–7 carve out extra singletons beyond the structural outlier</w:t>
-      </w:r>
-    </w:p>
-    <w:p>
-      <w:r>
-        <w:t>AskReddit, which is already alone at k = 5). At k = 5 the four remaining</w:t>
-      </w:r>
-    </w:p>
-    <w:p>
-      <w:r>
-        <w:t>groups are well populated (6–17 members each) and interpretable. The k = 5</w:t>
-      </w:r>
-    </w:p>
-    <w:p>
-      <w:r>
-        <w:t>solution is stable across random seeds (mean adjusted Rand index 0.88 over</w:t>
-      </w:r>
-    </w:p>
-    <w:p>
-      <w:r>
-        <w:t>19 seeds). We therefore use the clustering as a *labelling of visually</w:t>
-      </w:r>
-    </w:p>
-    <w:p>
-      <w:r>
-        <w:t>evident structure* in Figure 13, not as a claim of true cluster structure.</w:t>
+        <w:t xml:space="preserve">At k = 5 the five profiles are interpretable and four of them are well populated (6–17 members each). The k = 5 solution is stable across random seeds: re-running k-means under 19 different seeds and comparing each result to the reference solution gives a mean adjusted Rand index of 0.88. We therefore use the clustering as a </w:t>
+      </w:r>
+      <w:r>
+        <w:rPr>
+          <w:i/>
+        </w:rPr>
+        <w:t>labelling of visually evident structure</w:t>
+      </w:r>
+      <w:r>
+        <w:t xml:space="preserve"> in Figure 13, not as a claim of true cluster structure.</w:t>
       </w:r>
     </w:p>
     <w:sectPr>

</xml_diff>

<commit_message>
Add per-member AI disclosure forms on instructor template; Tableau attribution to Parthsarathi
</commit_message>
<xml_diff>
--- a/report/report.docx
+++ b/report/report.docx
@@ -3579,7 +3579,7 @@
           <w:p>
             <w:r/>
             <w:r>
-              <w:t>Task Set 2 (community comparison): derived the discussion-intensity measure, built Figures 4–8 (spectrum, content geometry, fingerprint heatmap, engagement map, style-persistence heatmap); findings F1–F3; co-authored F6; video segment on community comparison; Tableau dashboard co-demo.</w:t>
+              <w:t>Task Set 2 (community comparison): derived the discussion-intensity measure, built Figures 4–8 (spectrum, content geometry, fingerprint heatmap, engagement map, style-persistence heatmap); findings F1–F3; co-authored F6; video segment on community comparison.</w:t>
             </w:r>
           </w:p>
         </w:tc>
@@ -3606,7 +3606,16 @@
           <w:p>
             <w:r/>
             <w:r>
-              <w:t>Task Set 3 (trends &amp; relationships): platform/domain classification, Figures 9–12 (media shift, hosting migration, score-vs-comments, ratio-vs-comments); external verification of the platform-launch dates; findings F4, F7; video segment on trends and relationships.</w:t>
+              <w:t xml:space="preserve">Task Set 3 (trends &amp; relationships): platform/domain classification, Figures 9–12 (media shift, hosting migration, score-vs-comments, ratio-vs-comments); external verification of the platform-launch dates; findings F4, F7; </w:t>
+            </w:r>
+            <w:r>
+              <w:rPr>
+                <w:b/>
+              </w:rPr>
+              <w:t>built the Tableau dashboard ("Reddit Engagement Explorer") from the team's workbook specification and demonstrates it in the video</w:t>
+            </w:r>
+            <w:r>
+              <w:t>; video segment on trends and relationships.</w:t>
             </w:r>
           </w:p>
         </w:tc>
@@ -3628,16 +3637,52 @@
     </w:p>
     <w:p>
       <w:r>
-        <w:t xml:space="preserve">Each team member submits a separate, honestly completed declaration; the fillable forms are in </w:t>
+        <w:t>Each team member submits a separate, honestly completed declaration using the instructor's template (</w:t>
       </w:r>
       <w:r>
         <w:rPr>
           <w:rFonts w:ascii="Consolas" w:hAnsi="Consolas"/>
         </w:rPr>
-        <w:t>report/AI_declarations.md</w:t>
-      </w:r>
-      <w:r>
-        <w:t xml:space="preserve"> (one per member: Sidhanth Prabhu, Shrey Modi, Parthsarathi Samanta). The declarations must reflect each member's actual AI usage. As a team-level statement: AI tools assisted with code scaffolding, figure generation, and drafting; every statistic, figure, and external fact cited in this report was computed or verified by the team against the actual dataset and primary sources, and is reproducible via </w:t>
+        <w:t>DAS732-T1-26-27-AI-Disclosure-Statement.docx</w:t>
+      </w:r>
+      <w:r>
+        <w:t xml:space="preserve">). The filled forms are </w:t>
+      </w:r>
+      <w:r>
+        <w:rPr>
+          <w:rFonts w:ascii="Consolas" w:hAnsi="Consolas"/>
+        </w:rPr>
+        <w:t>report/AI_Declaration_Sidhanth_Prabhu.docx</w:t>
+      </w:r>
+      <w:r>
+        <w:t xml:space="preserve">, </w:t>
+      </w:r>
+      <w:r>
+        <w:rPr>
+          <w:rFonts w:ascii="Consolas" w:hAnsi="Consolas"/>
+        </w:rPr>
+        <w:t>report/AI_Declaration_Shrey_Modi.docx</w:t>
+      </w:r>
+      <w:r>
+        <w:t xml:space="preserve">, and </w:t>
+      </w:r>
+      <w:r>
+        <w:rPr>
+          <w:rFonts w:ascii="Consolas" w:hAnsi="Consolas"/>
+        </w:rPr>
+        <w:t>report/AI_Declaration_Parthsarathi_Samanta.docx</w:t>
+      </w:r>
+      <w:r>
+        <w:t xml:space="preserve"> (regenerable via </w:t>
+      </w:r>
+      <w:r>
+        <w:rPr>
+          <w:rFonts w:ascii="Consolas" w:hAnsi="Consolas"/>
+        </w:rPr>
+        <w:t>src/07_build_ai_declarations.py</w:t>
+      </w:r>
+      <w:r>
+        <w:t xml:space="preserve">; each member must review their copy and adjust tool names to their personal usage before signing). As a team-level statement: AI tools assisted with code scaffolding, figure generation, and drafting; every statistic, figure, and external fact cited in this report was computed or verified by the team against the actual dataset and primary sources, and is reproducible via </w:t>
       </w:r>
       <w:r>
         <w:rPr>

</xml_diff>